<commit_message>
Prepare Solo Suite v1.0.20 release candidate
</commit_message>
<xml_diff>
--- a/site-doctor-cheatsheet.docx
+++ b/site-doctor-cheatsheet.docx
@@ -48,7 +48,7 @@
           <w:sz w:val="18"/>
           <w:szCs w:val="18"/>
         </w:rPr>
-        <w:t xml:space="preserve">Complete audit, debug &amp; fix toolkit for production websites and databases  ·  Claude Code plugin  ·  v3.3.0</w:t>
+        <w:t>Complete audit, debug &amp; fix toolkit for production websites and databases  ·  Claude Code plugin  ·  v3.6.2</w:t>
       </w:r>
     </w:p>
     <w:p>
@@ -853,7 +853,7 @@
                 <w:sz w:val="19"/>
                 <w:szCs w:val="19"/>
               </w:rPr>
-              <w:t xml:space="preserve">Deep OWASP Top 10 review — injection, broken auth, access control / IDOR, XSS, SSRF, secrets, CVEs.</w:t>
+              <w:t>Static OWASP Top 10 code/config review — auth, access control / IDOR, injection, XSS, SSRF, secrets, CVEs; dynamic checks are manual-only.</w:t>
             </w:r>
           </w:p>
         </w:tc>
@@ -4240,7 +4240,7 @@
           <w:sz w:val="21"/>
           <w:szCs w:val="21"/>
         </w:rPr>
-        <w:t xml:space="preserve">  — scans a codebase for hardcoded secrets</w:t>
+        <w:t xml:space="preserve">  — redacted working-tree scan; optional bounded local Git-object history</w:t>
       </w:r>
     </w:p>
     <w:p>
@@ -4615,7 +4615,7 @@
                 <w:sz w:val="20"/>
                 <w:szCs w:val="20"/>
               </w:rPr>
-              <w:t xml:space="preserve">Do a deep security review of my web app at https://example.com — codebase is at ./src, which I own and am authorized to test. Run the secret scanner, then walk the full OWASP Top 10: injection, broken auth, access control/IDOR, XSS, SSRF, deserialization, and dependency CVEs. Tag each finding with its OWASP category and a non-destructive repro.</w:t>
+              <w:t>Do a static security review of my web app; the codebase is at ./src. Do not probe the live URL or make dynamic requests. Run the local redacted secret scanner, then review the OWASP Top 10 in code and configuration: injection, broken auth, access control/IDOR, XSS, SSRF, deserialization, and dependency CVEs. Tag each finding with code evidence and a non-destructive local repro. For anything requiring dynamic validation, provide a manual test plan and stop for explicit confirmation.</w:t>
             </w:r>
           </w:p>
         </w:tc>
@@ -5065,7 +5065,7 @@
                 <w:sz w:val="20"/>
                 <w:szCs w:val="20"/>
               </w:rPr>
-              <w:t xml:space="preserve">Audit my PostgreSQL database (read-only connection: postgres://readonly@host/db). Check schema quality, missing/redundant indexes, the slowest queries, security, and data integrity. Use read-only queries only, and give me a severity-ranked report with the exact query result as evidence and a migration or command for each fix.</w:t>
+              <w:t>Audit my PostgreSQL database using the read-only connection profile named APP_AUDIT_DB. Its credential is stored outside the repository; do not print its DSN or secret. Confirm that the session is read-only, then check schema quality, missing/redundant indexes, slow queries, security, and data integrity. Use read-only queries only and give me a severity-ranked report with redacted evidence plus a proposed migration or command for each fix.</w:t>
             </w:r>
           </w:p>
         </w:tc>
@@ -6416,7 +6416,7 @@
                 <w:sz w:val="20"/>
                 <w:szCs w:val="20"/>
               </w:rPr>
-              <w:t xml:space="preserve">Audit my signup and checkout forms on https://example.com for conversion and quality. Walk through completing them, then review field friction (are we asking for too much?), inline validation and error handling, accessibility (labels, keyboard, screen-reader errors), submission feedback and double-submit protection, security and spam protection, and the mobile input experience. Rank by conversion and access impact.</w:t>
+              <w:t>Audit my signup and checkout forms on https://example.com for conversion and quality using read-only UI/code inspection only; do not submit either form. Review field friction, inline validation and errors, accessibility (labels, keyboard, screen-reader errors), submission feedback and double-submit protection, security/spam protection, and mobile inputs. Rank findings by conversion and access impact. If end-to-end submission is needed, hand off to /browser:form-submit-test and stop for explicit approval.</w:t>
             </w:r>
           </w:p>
         </w:tc>
@@ -6783,15 +6783,96 @@
     </w:tbl>
     <w:p>
       <w:pPr>
-        <w:spacing w:after="160"/>
-      </w:pPr>
+        <w:spacing w:after="120"/>
+      </w:pPr>
+      <w:r>
+        <w:rPr>
+          <w:rFonts w:ascii="Calibri" w:cs="Calibri" w:eastAsia="Calibri" w:hAnsi="Calibri"/>
+          <w:b/>
+          <w:bCs/>
+          <w:color w:val="1F3864"/>
+          <w:sz w:val="28"/>
+          <w:szCs w:val="28"/>
+        </w:rPr>
+        <w:t xml:space="preserve">About this cheat sheet</w:t>
+      </w:r>
+    </w:p>
+    <w:p>
+      <w:pPr>
+        <w:spacing w:after="80"/>
+      </w:pPr>
+      <w:r>
+        <w:rPr>
+          <w:rFonts w:ascii="Calibri" w:cs="Calibri" w:eastAsia="Calibri" w:hAnsi="Calibri"/>
+          <w:color w:val="333333"/>
+          <w:sz w:val="20"/>
+          <w:szCs w:val="20"/>
+        </w:rPr>
+        <w:t>Version: site-doctor v3.6.2 — shipped with solo-suite 1.0.20 (MIT license).</w:t>
+      </w:r>
+    </w:p>
+    <w:p>
+      <w:pPr>
+        <w:spacing w:after="80"/>
+      </w:pPr>
+      <w:r>
+        <w:rPr>
+          <w:rFonts w:ascii="Calibri" w:cs="Calibri" w:eastAsia="Calibri" w:hAnsi="Calibri"/>
+          <w:color w:val="333333"/>
+          <w:sz w:val="20"/>
+          <w:szCs w:val="20"/>
+        </w:rPr>
+        <w:t xml:space="preserve">Install: /plugin marketplace add unn0wn002/solo-suite, then /plugin install site-doctor@solo-suite — or /plugin install full-team@solo-suite for the complete 18-plugin suite.</w:t>
+      </w:r>
+    </w:p>
+    <w:p>
+      <w:pPr>
+        <w:spacing w:after="80"/>
+      </w:pPr>
+      <w:r>
+        <w:rPr>
+          <w:rFonts w:ascii="Calibri" w:cs="Calibri" w:eastAsia="Calibri" w:hAnsi="Calibri"/>
+          <w:color w:val="333333"/>
+          <w:sz w:val="20"/>
+          <w:szCs w:val="20"/>
+        </w:rPr>
+        <w:t xml:space="preserve">Every audit here is read-only and evidence-based; the fix, migration, and load-test commands are manual-only and always confirm before changing anything. Vendor-specific checks run only for providers recorded in .solo/stack.md.</w:t>
+      </w:r>
+    </w:p>
+    <w:p>
+      <w:pPr>
+        <w:spacing w:after="80"/>
+      </w:pPr>
+      <w:r>
+        <w:rPr>
+          <w:rFonts w:ascii="Calibri" w:cs="Calibri" w:eastAsia="Calibri" w:hAnsi="Calibri"/>
+          <w:color w:val="333333"/>
+          <w:sz w:val="20"/>
+          <w:szCs w:val="20"/>
+        </w:rPr>
+        <w:t xml:space="preserve">Full command reference: README.md. Changes: CHANGELOG.md. Vulnerability reports: SECURITY.md.</w:t>
+      </w:r>
+    </w:p>
+    <w:p>
+      <w:pPr>
+        <w:spacing w:after="80"/>
+      </w:pPr>
+      <w:r>
+        <w:rPr>
+          <w:rFonts w:ascii="Calibri" w:cs="Calibri" w:eastAsia="Calibri" w:hAnsi="Calibri"/>
+          <w:color w:val="333333"/>
+          <w:sz w:val="20"/>
+          <w:szCs w:val="20"/>
+        </w:rPr>
+        <w:t xml:space="preserve">The bundled helper scripts are Python stdlib only and are invoked via ${CLAUDE_PLUGIN_ROOT}, so they work from any directory; outbound requests are SSRF-guarded by lib/url_guard.py, and the secret scanner reports only redacted, fingerprinted findings.</w:t>
+      </w:r>
     </w:p>
     <w:p>
       <w:pPr>
         <w:pBdr>
-          <w:top w:val="single" w:color="C9D4E0" w:sz="8" w:space="6"/>
+          <w:top w:val="single" w:color="C9D4E0" w:sz="8" w:space="2"/>
         </w:pBdr>
-        <w:spacing w:before="120"/>
+        <w:spacing w:before="0" w:after="0"/>
       </w:pPr>
       <w:r>
         <w:rPr>
@@ -6813,10 +6894,6 @@
     </w:sectPr>
   </w:body>
 </w:document>
-</file>
-
-<file path=word/comments.xml><?xml version="1.0" encoding="utf-8"?>
-<w:comments xmlns:cx="http://schemas.microsoft.com/office/drawing/2014/chartex" xmlns:cx1="http://schemas.microsoft.com/office/drawing/2015/9/8/chartex" xmlns:cx2="http://schemas.microsoft.com/office/drawing/2015/10/21/chartex" xmlns:cx3="http://schemas.microsoft.com/office/drawing/2016/5/9/chartex" xmlns:cx4="http://schemas.microsoft.com/office/drawing/2016/5/10/chartex" xmlns:cx5="http://schemas.microsoft.com/office/drawing/2016/5/11/chartex" xmlns:cx6="http://schemas.microsoft.com/office/drawing/2016/5/12/chartex" xmlns:cx7="http://schemas.microsoft.com/office/drawing/2016/5/13/chartex" xmlns:cx8="http://schemas.microsoft.com/office/drawing/2016/5/14/chartex" xmlns:mc="http://schemas.openxmlformats.org/markup-compatibility/2006" xmlns:aink="http://schemas.microsoft.com/office/drawing/2016/ink" xmlns:am3d="http://schemas.microsoft.com/office/drawing/2017/model3d" xmlns:o="urn:schemas-microsoft-com:office:office" xmlns:r="http://schemas.openxmlformats.org/officeDocument/2006/relationships" xmlns:m="http://schemas.openxmlformats.org/officeDocument/2006/math" xmlns:v="urn:schemas-microsoft-com:vml" xmlns:wp14="http://schemas.microsoft.com/office/word/2010/wordprocessingDrawing" xmlns:wp="http://schemas.openxmlformats.org/drawingml/2006/wordprocessingDrawing" xmlns:w10="urn:schemas-microsoft-com:office:word" xmlns:w="http://schemas.openxmlformats.org/wordprocessingml/2006/main" xmlns:w14="http://schemas.microsoft.com/office/word/2010/wordml" xmlns:w15="http://schemas.microsoft.com/office/word/2012/wordml" xmlns:w16cex="http://schemas.microsoft.com/office/word/2018/wordml/cex" xmlns:w16cid="http://schemas.microsoft.com/office/word/2016/wordml/cid" xmlns:w16="http://schemas.microsoft.com/office/word/2018/wordml" xmlns:w16sdtdh="http://schemas.microsoft.com/office/word/2020/wordml/sdtdatahash" xmlns:w16se="http://schemas.microsoft.com/office/word/2015/wordml/symex" xmlns:wpg="http://schemas.microsoft.com/office/word/2010/wordprocessingGroup" xmlns:wpi="http://schemas.microsoft.com/office/word/2010/wordprocessingInk" xmlns:wne="http://schemas.microsoft.com/office/word/2006/wordml" xmlns:wps="http://schemas.microsoft.com/office/word/2010/wordprocessingShape"/>
 </file>
 
 <file path=word/endnotes.xml><?xml version="1.0" encoding="utf-8"?>

</xml_diff>

<commit_message>
Prepare Solo Suite v1.0.21 release candidate
</commit_message>
<xml_diff>
--- a/site-doctor-cheatsheet.docx
+++ b/site-doctor-cheatsheet.docx
@@ -48,7 +48,7 @@
           <w:sz w:val="18"/>
           <w:szCs w:val="18"/>
         </w:rPr>
-        <w:t xml:space="preserve">Complete audit, debug &amp; fix toolkit for production websites and databases  ·  Claude Code plugin  ·  v3.3.0</w:t>
+        <w:t>Complete audit, debug &amp; fix toolkit for production websites and databases  ·  Claude Code plugin  ·  v3.6.2</w:t>
       </w:r>
     </w:p>
     <w:p>
@@ -853,7 +853,7 @@
                 <w:sz w:val="19"/>
                 <w:szCs w:val="19"/>
               </w:rPr>
-              <w:t xml:space="preserve">Deep OWASP Top 10 review — injection, broken auth, access control / IDOR, XSS, SSRF, secrets, CVEs.</w:t>
+              <w:t>Static OWASP Top 10 code/config review — auth, access control / IDOR, injection, XSS, SSRF, secrets, CVEs; dynamic checks are manual-only.</w:t>
             </w:r>
           </w:p>
         </w:tc>
@@ -4240,7 +4240,7 @@
           <w:sz w:val="21"/>
           <w:szCs w:val="21"/>
         </w:rPr>
-        <w:t xml:space="preserve">  — scans a codebase for hardcoded secrets</w:t>
+        <w:t xml:space="preserve">  — redacted working-tree scan; optional bounded local Git-object history</w:t>
       </w:r>
     </w:p>
     <w:p>
@@ -4615,7 +4615,7 @@
                 <w:sz w:val="20"/>
                 <w:szCs w:val="20"/>
               </w:rPr>
-              <w:t xml:space="preserve">Do a deep security review of my web app at https://example.com — codebase is at ./src, which I own and am authorized to test. Run the secret scanner, then walk the full OWASP Top 10: injection, broken auth, access control/IDOR, XSS, SSRF, deserialization, and dependency CVEs. Tag each finding with its OWASP category and a non-destructive repro.</w:t>
+              <w:t>Do a static security review of my web app; the codebase is at ./src. Do not probe the live URL or make dynamic requests. Run the local redacted secret scanner, then review the OWASP Top 10 in code and configuration: injection, broken auth, access control/IDOR, XSS, SSRF, deserialization, and dependency CVEs. Tag each finding with code evidence and a non-destructive local repro. For anything requiring dynamic validation, provide a manual test plan and stop for explicit confirmation.</w:t>
             </w:r>
           </w:p>
         </w:tc>
@@ -5065,7 +5065,7 @@
                 <w:sz w:val="20"/>
                 <w:szCs w:val="20"/>
               </w:rPr>
-              <w:t xml:space="preserve">Audit my PostgreSQL database (read-only connection: postgres://readonly@host/db). Check schema quality, missing/redundant indexes, the slowest queries, security, and data integrity. Use read-only queries only, and give me a severity-ranked report with the exact query result as evidence and a migration or command for each fix.</w:t>
+              <w:t>Audit my PostgreSQL database using the read-only connection profile named APP_AUDIT_DB. Its credential is stored outside the repository; do not print its DSN or secret. Confirm that the session is read-only, then check schema quality, missing/redundant indexes, slow queries, security, and data integrity. Use read-only queries only and give me a severity-ranked report with redacted evidence plus a proposed migration or command for each fix.</w:t>
             </w:r>
           </w:p>
         </w:tc>
@@ -6416,7 +6416,7 @@
                 <w:sz w:val="20"/>
                 <w:szCs w:val="20"/>
               </w:rPr>
-              <w:t xml:space="preserve">Audit my signup and checkout forms on https://example.com for conversion and quality. Walk through completing them, then review field friction (are we asking for too much?), inline validation and error handling, accessibility (labels, keyboard, screen-reader errors), submission feedback and double-submit protection, security and spam protection, and the mobile input experience. Rank by conversion and access impact.</w:t>
+              <w:t>Audit my signup and checkout forms on https://example.com for conversion and quality using read-only UI/code inspection only; do not submit either form. Review field friction, inline validation and errors, accessibility (labels, keyboard, screen-reader errors), submission feedback and double-submit protection, security/spam protection, and mobile inputs. Rank findings by conversion and access impact. If end-to-end submission is needed, hand off to /browser:form-submit-test and stop for explicit approval.</w:t>
             </w:r>
           </w:p>
         </w:tc>
@@ -6783,15 +6783,96 @@
     </w:tbl>
     <w:p>
       <w:pPr>
-        <w:spacing w:after="160"/>
-      </w:pPr>
+        <w:spacing w:after="120"/>
+      </w:pPr>
+      <w:r>
+        <w:rPr>
+          <w:rFonts w:ascii="Calibri" w:cs="Calibri" w:eastAsia="Calibri" w:hAnsi="Calibri"/>
+          <w:b/>
+          <w:bCs/>
+          <w:color w:val="1F3864"/>
+          <w:sz w:val="28"/>
+          <w:szCs w:val="28"/>
+        </w:rPr>
+        <w:t xml:space="preserve">About this cheat sheet</w:t>
+      </w:r>
+    </w:p>
+    <w:p>
+      <w:pPr>
+        <w:spacing w:after="80"/>
+      </w:pPr>
+      <w:r>
+        <w:rPr>
+          <w:rFonts w:ascii="Calibri" w:cs="Calibri" w:eastAsia="Calibri" w:hAnsi="Calibri"/>
+          <w:color w:val="333333"/>
+          <w:sz w:val="20"/>
+          <w:szCs w:val="20"/>
+        </w:rPr>
+        <w:t>Version: site-doctor v3.6.2 — shipped with solo-suite 1.0.21 (MIT license).</w:t>
+      </w:r>
+    </w:p>
+    <w:p>
+      <w:pPr>
+        <w:spacing w:after="80"/>
+      </w:pPr>
+      <w:r>
+        <w:rPr>
+          <w:rFonts w:ascii="Calibri" w:cs="Calibri" w:eastAsia="Calibri" w:hAnsi="Calibri"/>
+          <w:color w:val="333333"/>
+          <w:sz w:val="20"/>
+          <w:szCs w:val="20"/>
+        </w:rPr>
+        <w:t xml:space="preserve">Install: /plugin marketplace add unn0wn002/solo-suite, then /plugin install site-doctor@solo-suite — or /plugin install full-team@solo-suite for the complete 18-plugin suite.</w:t>
+      </w:r>
+    </w:p>
+    <w:p>
+      <w:pPr>
+        <w:spacing w:after="80"/>
+      </w:pPr>
+      <w:r>
+        <w:rPr>
+          <w:rFonts w:ascii="Calibri" w:cs="Calibri" w:eastAsia="Calibri" w:hAnsi="Calibri"/>
+          <w:color w:val="333333"/>
+          <w:sz w:val="20"/>
+          <w:szCs w:val="20"/>
+        </w:rPr>
+        <w:t xml:space="preserve">Every audit here is read-only and evidence-based; the fix, migration, and load-test commands are manual-only and always confirm before changing anything. Vendor-specific checks run only for providers recorded in .solo/stack.md.</w:t>
+      </w:r>
+    </w:p>
+    <w:p>
+      <w:pPr>
+        <w:spacing w:after="80"/>
+      </w:pPr>
+      <w:r>
+        <w:rPr>
+          <w:rFonts w:ascii="Calibri" w:cs="Calibri" w:eastAsia="Calibri" w:hAnsi="Calibri"/>
+          <w:color w:val="333333"/>
+          <w:sz w:val="20"/>
+          <w:szCs w:val="20"/>
+        </w:rPr>
+        <w:t xml:space="preserve">Full command reference: README.md. Changes: CHANGELOG.md. Vulnerability reports: SECURITY.md.</w:t>
+      </w:r>
+    </w:p>
+    <w:p>
+      <w:pPr>
+        <w:spacing w:after="80"/>
+      </w:pPr>
+      <w:r>
+        <w:rPr>
+          <w:rFonts w:ascii="Calibri" w:cs="Calibri" w:eastAsia="Calibri" w:hAnsi="Calibri"/>
+          <w:color w:val="333333"/>
+          <w:sz w:val="20"/>
+          <w:szCs w:val="20"/>
+        </w:rPr>
+        <w:t xml:space="preserve">The bundled helper scripts are Python stdlib only and are invoked via ${CLAUDE_PLUGIN_ROOT}, so they work from any directory; outbound requests are SSRF-guarded by lib/url_guard.py, and the secret scanner reports only redacted, fingerprinted findings.</w:t>
+      </w:r>
     </w:p>
     <w:p>
       <w:pPr>
         <w:pBdr>
-          <w:top w:val="single" w:color="C9D4E0" w:sz="8" w:space="6"/>
+          <w:top w:val="single" w:color="C9D4E0" w:sz="8" w:space="2"/>
         </w:pBdr>
-        <w:spacing w:before="120"/>
+        <w:spacing w:before="0" w:after="0"/>
       </w:pPr>
       <w:r>
         <w:rPr>
@@ -6813,10 +6894,6 @@
     </w:sectPr>
   </w:body>
 </w:document>
-</file>
-
-<file path=word/comments.xml><?xml version="1.0" encoding="utf-8"?>
-<w:comments xmlns:cx="http://schemas.microsoft.com/office/drawing/2014/chartex" xmlns:cx1="http://schemas.microsoft.com/office/drawing/2015/9/8/chartex" xmlns:cx2="http://schemas.microsoft.com/office/drawing/2015/10/21/chartex" xmlns:cx3="http://schemas.microsoft.com/office/drawing/2016/5/9/chartex" xmlns:cx4="http://schemas.microsoft.com/office/drawing/2016/5/10/chartex" xmlns:cx5="http://schemas.microsoft.com/office/drawing/2016/5/11/chartex" xmlns:cx6="http://schemas.microsoft.com/office/drawing/2016/5/12/chartex" xmlns:cx7="http://schemas.microsoft.com/office/drawing/2016/5/13/chartex" xmlns:cx8="http://schemas.microsoft.com/office/drawing/2016/5/14/chartex" xmlns:mc="http://schemas.openxmlformats.org/markup-compatibility/2006" xmlns:aink="http://schemas.microsoft.com/office/drawing/2016/ink" xmlns:am3d="http://schemas.microsoft.com/office/drawing/2017/model3d" xmlns:o="urn:schemas-microsoft-com:office:office" xmlns:r="http://schemas.openxmlformats.org/officeDocument/2006/relationships" xmlns:m="http://schemas.openxmlformats.org/officeDocument/2006/math" xmlns:v="urn:schemas-microsoft-com:vml" xmlns:wp14="http://schemas.microsoft.com/office/word/2010/wordprocessingDrawing" xmlns:wp="http://schemas.openxmlformats.org/drawingml/2006/wordprocessingDrawing" xmlns:w10="urn:schemas-microsoft-com:office:word" xmlns:w="http://schemas.openxmlformats.org/wordprocessingml/2006/main" xmlns:w14="http://schemas.microsoft.com/office/word/2010/wordml" xmlns:w15="http://schemas.microsoft.com/office/word/2012/wordml" xmlns:w16cex="http://schemas.microsoft.com/office/word/2018/wordml/cex" xmlns:w16cid="http://schemas.microsoft.com/office/word/2016/wordml/cid" xmlns:w16="http://schemas.microsoft.com/office/word/2018/wordml" xmlns:w16sdtdh="http://schemas.microsoft.com/office/word/2020/wordml/sdtdatahash" xmlns:w16se="http://schemas.microsoft.com/office/word/2015/wordml/symex" xmlns:wpg="http://schemas.microsoft.com/office/word/2010/wordprocessingGroup" xmlns:wpi="http://schemas.microsoft.com/office/word/2010/wordprocessingInk" xmlns:wne="http://schemas.microsoft.com/office/word/2006/wordml" xmlns:wps="http://schemas.microsoft.com/office/word/2010/wordprocessingShape"/>
 </file>
 
 <file path=word/endnotes.xml><?xml version="1.0" encoding="utf-8"?>

</xml_diff>

<commit_message>
Prepare Solo Suite v1.0.22 release candidate
</commit_message>
<xml_diff>
--- a/site-doctor-cheatsheet.docx
+++ b/site-doctor-cheatsheet.docx
@@ -48,7 +48,7 @@
           <w:sz w:val="18"/>
           <w:szCs w:val="18"/>
         </w:rPr>
-        <w:t xml:space="preserve">Complete audit, debug &amp; fix toolkit for production websites and databases  ·  Claude Code plugin  ·  v3.3.0</w:t>
+        <w:t>Complete audit, debug &amp; fix toolkit for production websites and databases  ·  Claude Code plugin  ·  v3.6.2</w:t>
       </w:r>
     </w:p>
     <w:p>
@@ -853,7 +853,7 @@
                 <w:sz w:val="19"/>
                 <w:szCs w:val="19"/>
               </w:rPr>
-              <w:t xml:space="preserve">Deep OWASP Top 10 review — injection, broken auth, access control / IDOR, XSS, SSRF, secrets, CVEs.</w:t>
+              <w:t>Static OWASP Top 10 code/config review — auth, access control / IDOR, injection, XSS, SSRF, secrets, CVEs; dynamic checks are manual-only.</w:t>
             </w:r>
           </w:p>
         </w:tc>
@@ -4240,7 +4240,7 @@
           <w:sz w:val="21"/>
           <w:szCs w:val="21"/>
         </w:rPr>
-        <w:t xml:space="preserve">  — scans a codebase for hardcoded secrets</w:t>
+        <w:t xml:space="preserve">  — redacted working-tree scan; optional bounded local Git-object history</w:t>
       </w:r>
     </w:p>
     <w:p>
@@ -4615,7 +4615,7 @@
                 <w:sz w:val="20"/>
                 <w:szCs w:val="20"/>
               </w:rPr>
-              <w:t xml:space="preserve">Do a deep security review of my web app at https://example.com — codebase is at ./src, which I own and am authorized to test. Run the secret scanner, then walk the full OWASP Top 10: injection, broken auth, access control/IDOR, XSS, SSRF, deserialization, and dependency CVEs. Tag each finding with its OWASP category and a non-destructive repro.</w:t>
+              <w:t>Do a static security review of my web app; the codebase is at ./src. Do not probe the live URL or make dynamic requests. Run the local redacted secret scanner, then review the OWASP Top 10 in code and configuration: injection, broken auth, access control/IDOR, XSS, SSRF, deserialization, and dependency CVEs. Tag each finding with code evidence and a non-destructive local repro. For anything requiring dynamic validation, provide a manual test plan and stop for explicit confirmation.</w:t>
             </w:r>
           </w:p>
         </w:tc>
@@ -5065,7 +5065,7 @@
                 <w:sz w:val="20"/>
                 <w:szCs w:val="20"/>
               </w:rPr>
-              <w:t xml:space="preserve">Audit my PostgreSQL database (read-only connection: postgres://readonly@host/db). Check schema quality, missing/redundant indexes, the slowest queries, security, and data integrity. Use read-only queries only, and give me a severity-ranked report with the exact query result as evidence and a migration or command for each fix.</w:t>
+              <w:t>Audit my PostgreSQL database using the read-only connection profile named APP_AUDIT_DB. Its credential is stored outside the repository; do not print its DSN or secret. Confirm that the session is read-only, then check schema quality, missing/redundant indexes, slow queries, security, and data integrity. Use read-only queries only and give me a severity-ranked report with redacted evidence plus a proposed migration or command for each fix.</w:t>
             </w:r>
           </w:p>
         </w:tc>
@@ -6416,7 +6416,7 @@
                 <w:sz w:val="20"/>
                 <w:szCs w:val="20"/>
               </w:rPr>
-              <w:t xml:space="preserve">Audit my signup and checkout forms on https://example.com for conversion and quality. Walk through completing them, then review field friction (are we asking for too much?), inline validation and error handling, accessibility (labels, keyboard, screen-reader errors), submission feedback and double-submit protection, security and spam protection, and the mobile input experience. Rank by conversion and access impact.</w:t>
+              <w:t>Audit my signup and checkout forms on https://example.com for conversion and quality using read-only UI/code inspection only; do not submit either form. Review field friction, inline validation and errors, accessibility (labels, keyboard, screen-reader errors), submission feedback and double-submit protection, security/spam protection, and mobile inputs. Rank findings by conversion and access impact. If end-to-end submission is needed, hand off to /browser:form-submit-test and stop for explicit approval.</w:t>
             </w:r>
           </w:p>
         </w:tc>
@@ -6783,15 +6783,96 @@
     </w:tbl>
     <w:p>
       <w:pPr>
-        <w:spacing w:after="160"/>
-      </w:pPr>
+        <w:spacing w:after="120"/>
+      </w:pPr>
+      <w:r>
+        <w:rPr>
+          <w:rFonts w:ascii="Calibri" w:cs="Calibri" w:eastAsia="Calibri" w:hAnsi="Calibri"/>
+          <w:b/>
+          <w:bCs/>
+          <w:color w:val="1F3864"/>
+          <w:sz w:val="28"/>
+          <w:szCs w:val="28"/>
+        </w:rPr>
+        <w:t xml:space="preserve">About this cheat sheet</w:t>
+      </w:r>
+    </w:p>
+    <w:p>
+      <w:pPr>
+        <w:spacing w:after="80"/>
+      </w:pPr>
+      <w:r>
+        <w:rPr>
+          <w:rFonts w:ascii="Calibri" w:cs="Calibri" w:eastAsia="Calibri" w:hAnsi="Calibri"/>
+          <w:color w:val="333333"/>
+          <w:sz w:val="20"/>
+          <w:szCs w:val="20"/>
+        </w:rPr>
+        <w:t>Version: site-doctor v3.6.2 — shipped with solo-suite 1.0.22 (MIT license).</w:t>
+      </w:r>
+    </w:p>
+    <w:p>
+      <w:pPr>
+        <w:spacing w:after="80"/>
+      </w:pPr>
+      <w:r>
+        <w:rPr>
+          <w:rFonts w:ascii="Calibri" w:cs="Calibri" w:eastAsia="Calibri" w:hAnsi="Calibri"/>
+          <w:color w:val="333333"/>
+          <w:sz w:val="20"/>
+          <w:szCs w:val="20"/>
+        </w:rPr>
+        <w:t xml:space="preserve">Install: /plugin marketplace add unn0wn002/solo-suite, then /plugin install site-doctor@solo-suite — or /plugin install full-team@solo-suite for the complete 18-plugin suite.</w:t>
+      </w:r>
+    </w:p>
+    <w:p>
+      <w:pPr>
+        <w:spacing w:after="80"/>
+      </w:pPr>
+      <w:r>
+        <w:rPr>
+          <w:rFonts w:ascii="Calibri" w:cs="Calibri" w:eastAsia="Calibri" w:hAnsi="Calibri"/>
+          <w:color w:val="333333"/>
+          <w:sz w:val="20"/>
+          <w:szCs w:val="20"/>
+        </w:rPr>
+        <w:t xml:space="preserve">Every audit here is read-only and evidence-based; the fix, migration, and load-test commands are manual-only and always confirm before changing anything. Vendor-specific checks run only for providers recorded in .solo/stack.md.</w:t>
+      </w:r>
+    </w:p>
+    <w:p>
+      <w:pPr>
+        <w:spacing w:after="80"/>
+      </w:pPr>
+      <w:r>
+        <w:rPr>
+          <w:rFonts w:ascii="Calibri" w:cs="Calibri" w:eastAsia="Calibri" w:hAnsi="Calibri"/>
+          <w:color w:val="333333"/>
+          <w:sz w:val="20"/>
+          <w:szCs w:val="20"/>
+        </w:rPr>
+        <w:t xml:space="preserve">Full command reference: README.md. Changes: CHANGELOG.md. Vulnerability reports: SECURITY.md.</w:t>
+      </w:r>
+    </w:p>
+    <w:p>
+      <w:pPr>
+        <w:spacing w:after="80"/>
+      </w:pPr>
+      <w:r>
+        <w:rPr>
+          <w:rFonts w:ascii="Calibri" w:cs="Calibri" w:eastAsia="Calibri" w:hAnsi="Calibri"/>
+          <w:color w:val="333333"/>
+          <w:sz w:val="20"/>
+          <w:szCs w:val="20"/>
+        </w:rPr>
+        <w:t xml:space="preserve">The bundled helper scripts are Python stdlib only and are invoked via ${CLAUDE_PLUGIN_ROOT}, so they work from any directory; outbound requests are SSRF-guarded by lib/url_guard.py, and the secret scanner reports only redacted, fingerprinted findings.</w:t>
+      </w:r>
     </w:p>
     <w:p>
       <w:pPr>
         <w:pBdr>
-          <w:top w:val="single" w:color="C9D4E0" w:sz="8" w:space="6"/>
+          <w:top w:val="single" w:color="C9D4E0" w:sz="8" w:space="2"/>
         </w:pBdr>
-        <w:spacing w:before="120"/>
+        <w:spacing w:before="0" w:after="0"/>
       </w:pPr>
       <w:r>
         <w:rPr>
@@ -6813,10 +6894,6 @@
     </w:sectPr>
   </w:body>
 </w:document>
-</file>
-
-<file path=word/comments.xml><?xml version="1.0" encoding="utf-8"?>
-<w:comments xmlns:cx="http://schemas.microsoft.com/office/drawing/2014/chartex" xmlns:cx1="http://schemas.microsoft.com/office/drawing/2015/9/8/chartex" xmlns:cx2="http://schemas.microsoft.com/office/drawing/2015/10/21/chartex" xmlns:cx3="http://schemas.microsoft.com/office/drawing/2016/5/9/chartex" xmlns:cx4="http://schemas.microsoft.com/office/drawing/2016/5/10/chartex" xmlns:cx5="http://schemas.microsoft.com/office/drawing/2016/5/11/chartex" xmlns:cx6="http://schemas.microsoft.com/office/drawing/2016/5/12/chartex" xmlns:cx7="http://schemas.microsoft.com/office/drawing/2016/5/13/chartex" xmlns:cx8="http://schemas.microsoft.com/office/drawing/2016/5/14/chartex" xmlns:mc="http://schemas.openxmlformats.org/markup-compatibility/2006" xmlns:aink="http://schemas.microsoft.com/office/drawing/2016/ink" xmlns:am3d="http://schemas.microsoft.com/office/drawing/2017/model3d" xmlns:o="urn:schemas-microsoft-com:office:office" xmlns:r="http://schemas.openxmlformats.org/officeDocument/2006/relationships" xmlns:m="http://schemas.openxmlformats.org/officeDocument/2006/math" xmlns:v="urn:schemas-microsoft-com:vml" xmlns:wp14="http://schemas.microsoft.com/office/word/2010/wordprocessingDrawing" xmlns:wp="http://schemas.openxmlformats.org/drawingml/2006/wordprocessingDrawing" xmlns:w10="urn:schemas-microsoft-com:office:word" xmlns:w="http://schemas.openxmlformats.org/wordprocessingml/2006/main" xmlns:w14="http://schemas.microsoft.com/office/word/2010/wordml" xmlns:w15="http://schemas.microsoft.com/office/word/2012/wordml" xmlns:w16cex="http://schemas.microsoft.com/office/word/2018/wordml/cex" xmlns:w16cid="http://schemas.microsoft.com/office/word/2016/wordml/cid" xmlns:w16="http://schemas.microsoft.com/office/word/2018/wordml" xmlns:w16sdtdh="http://schemas.microsoft.com/office/word/2020/wordml/sdtdatahash" xmlns:w16se="http://schemas.microsoft.com/office/word/2015/wordml/symex" xmlns:wpg="http://schemas.microsoft.com/office/word/2010/wordprocessingGroup" xmlns:wpi="http://schemas.microsoft.com/office/word/2010/wordprocessingInk" xmlns:wne="http://schemas.microsoft.com/office/word/2006/wordml" xmlns:wps="http://schemas.microsoft.com/office/word/2010/wordprocessingShape"/>
 </file>
 
 <file path=word/endnotes.xml><?xml version="1.0" encoding="utf-8"?>

</xml_diff>

<commit_message>
Prepare Solo Suite v1.0.23 release candidate
</commit_message>
<xml_diff>
--- a/site-doctor-cheatsheet.docx
+++ b/site-doctor-cheatsheet.docx
@@ -48,7 +48,7 @@
           <w:sz w:val="18"/>
           <w:szCs w:val="18"/>
         </w:rPr>
-        <w:t xml:space="preserve">Complete audit, debug &amp; fix toolkit for production websites and databases  ·  Claude Code plugin  ·  v3.3.0</w:t>
+        <w:t>Complete audit, debug &amp; fix toolkit for production websites and databases  ·  Claude Code plugin  ·  v3.6.2</w:t>
       </w:r>
     </w:p>
     <w:p>
@@ -853,7 +853,7 @@
                 <w:sz w:val="19"/>
                 <w:szCs w:val="19"/>
               </w:rPr>
-              <w:t xml:space="preserve">Deep OWASP Top 10 review — injection, broken auth, access control / IDOR, XSS, SSRF, secrets, CVEs.</w:t>
+              <w:t>Static OWASP Top 10 code/config review — auth, access control / IDOR, injection, XSS, SSRF, secrets, CVEs; dynamic checks are manual-only.</w:t>
             </w:r>
           </w:p>
         </w:tc>
@@ -4240,7 +4240,7 @@
           <w:sz w:val="21"/>
           <w:szCs w:val="21"/>
         </w:rPr>
-        <w:t xml:space="preserve">  — scans a codebase for hardcoded secrets</w:t>
+        <w:t xml:space="preserve">  — redacted working-tree scan; optional bounded local Git-object history</w:t>
       </w:r>
     </w:p>
     <w:p>
@@ -4615,7 +4615,7 @@
                 <w:sz w:val="20"/>
                 <w:szCs w:val="20"/>
               </w:rPr>
-              <w:t xml:space="preserve">Do a deep security review of my web app at https://example.com — codebase is at ./src, which I own and am authorized to test. Run the secret scanner, then walk the full OWASP Top 10: injection, broken auth, access control/IDOR, XSS, SSRF, deserialization, and dependency CVEs. Tag each finding with its OWASP category and a non-destructive repro.</w:t>
+              <w:t>Do a static security review of my web app; the codebase is at ./src. Do not probe the live URL or make dynamic requests. Run the local redacted secret scanner, then review the OWASP Top 10 in code and configuration: injection, broken auth, access control/IDOR, XSS, SSRF, deserialization, and dependency CVEs. Tag each finding with code evidence and a non-destructive local repro. For anything requiring dynamic validation, provide a manual test plan and stop for explicit confirmation.</w:t>
             </w:r>
           </w:p>
         </w:tc>
@@ -5065,7 +5065,7 @@
                 <w:sz w:val="20"/>
                 <w:szCs w:val="20"/>
               </w:rPr>
-              <w:t xml:space="preserve">Audit my PostgreSQL database (read-only connection: postgres://readonly@host/db). Check schema quality, missing/redundant indexes, the slowest queries, security, and data integrity. Use read-only queries only, and give me a severity-ranked report with the exact query result as evidence and a migration or command for each fix.</w:t>
+              <w:t>Audit my PostgreSQL database using the read-only connection profile named APP_AUDIT_DB. Its credential is stored outside the repository; do not print its DSN or secret. Confirm that the session is read-only, then check schema quality, missing/redundant indexes, slow queries, security, and data integrity. Use read-only queries only and give me a severity-ranked report with redacted evidence plus a proposed migration or command for each fix.</w:t>
             </w:r>
           </w:p>
         </w:tc>
@@ -6416,7 +6416,7 @@
                 <w:sz w:val="20"/>
                 <w:szCs w:val="20"/>
               </w:rPr>
-              <w:t xml:space="preserve">Audit my signup and checkout forms on https://example.com for conversion and quality. Walk through completing them, then review field friction (are we asking for too much?), inline validation and error handling, accessibility (labels, keyboard, screen-reader errors), submission feedback and double-submit protection, security and spam protection, and the mobile input experience. Rank by conversion and access impact.</w:t>
+              <w:t>Audit my signup and checkout forms on https://example.com for conversion and quality using read-only UI/code inspection only; do not submit either form. Review field friction, inline validation and errors, accessibility (labels, keyboard, screen-reader errors), submission feedback and double-submit protection, security/spam protection, and mobile inputs. Rank findings by conversion and access impact. If end-to-end submission is needed, hand off to /browser:form-submit-test and stop for explicit approval.</w:t>
             </w:r>
           </w:p>
         </w:tc>
@@ -6783,15 +6783,96 @@
     </w:tbl>
     <w:p>
       <w:pPr>
-        <w:spacing w:after="160"/>
-      </w:pPr>
+        <w:spacing w:after="120"/>
+      </w:pPr>
+      <w:r>
+        <w:rPr>
+          <w:rFonts w:ascii="Calibri" w:cs="Calibri" w:eastAsia="Calibri" w:hAnsi="Calibri"/>
+          <w:b/>
+          <w:bCs/>
+          <w:color w:val="1F3864"/>
+          <w:sz w:val="28"/>
+          <w:szCs w:val="28"/>
+        </w:rPr>
+        <w:t xml:space="preserve">About this cheat sheet</w:t>
+      </w:r>
+    </w:p>
+    <w:p>
+      <w:pPr>
+        <w:spacing w:after="80"/>
+      </w:pPr>
+      <w:r>
+        <w:rPr>
+          <w:rFonts w:ascii="Calibri" w:cs="Calibri" w:eastAsia="Calibri" w:hAnsi="Calibri"/>
+          <w:color w:val="333333"/>
+          <w:sz w:val="20"/>
+          <w:szCs w:val="20"/>
+        </w:rPr>
+        <w:t>Version: site-doctor v3.6.2 — shipped with solo-suite 1.0.23 (MIT license).</w:t>
+      </w:r>
+    </w:p>
+    <w:p>
+      <w:pPr>
+        <w:spacing w:after="80"/>
+      </w:pPr>
+      <w:r>
+        <w:rPr>
+          <w:rFonts w:ascii="Calibri" w:cs="Calibri" w:eastAsia="Calibri" w:hAnsi="Calibri"/>
+          <w:color w:val="333333"/>
+          <w:sz w:val="20"/>
+          <w:szCs w:val="20"/>
+        </w:rPr>
+        <w:t xml:space="preserve">Install: /plugin marketplace add unn0wn002/solo-suite, then /plugin install site-doctor@solo-suite — or /plugin install full-team@solo-suite for the complete 18-plugin suite.</w:t>
+      </w:r>
+    </w:p>
+    <w:p>
+      <w:pPr>
+        <w:spacing w:after="80"/>
+      </w:pPr>
+      <w:r>
+        <w:rPr>
+          <w:rFonts w:ascii="Calibri" w:cs="Calibri" w:eastAsia="Calibri" w:hAnsi="Calibri"/>
+          <w:color w:val="333333"/>
+          <w:sz w:val="20"/>
+          <w:szCs w:val="20"/>
+        </w:rPr>
+        <w:t xml:space="preserve">Every audit here is read-only and evidence-based; the fix, migration, and load-test commands are manual-only and always confirm before changing anything. Vendor-specific checks run only for providers recorded in .solo/stack.md.</w:t>
+      </w:r>
+    </w:p>
+    <w:p>
+      <w:pPr>
+        <w:spacing w:after="80"/>
+      </w:pPr>
+      <w:r>
+        <w:rPr>
+          <w:rFonts w:ascii="Calibri" w:cs="Calibri" w:eastAsia="Calibri" w:hAnsi="Calibri"/>
+          <w:color w:val="333333"/>
+          <w:sz w:val="20"/>
+          <w:szCs w:val="20"/>
+        </w:rPr>
+        <w:t xml:space="preserve">Full command reference: README.md. Changes: CHANGELOG.md. Vulnerability reports: SECURITY.md.</w:t>
+      </w:r>
+    </w:p>
+    <w:p>
+      <w:pPr>
+        <w:spacing w:after="80"/>
+      </w:pPr>
+      <w:r>
+        <w:rPr>
+          <w:rFonts w:ascii="Calibri" w:cs="Calibri" w:eastAsia="Calibri" w:hAnsi="Calibri"/>
+          <w:color w:val="333333"/>
+          <w:sz w:val="20"/>
+          <w:szCs w:val="20"/>
+        </w:rPr>
+        <w:t xml:space="preserve">The bundled helper scripts are Python stdlib only and are invoked via ${CLAUDE_PLUGIN_ROOT}, so they work from any directory; outbound requests are SSRF-guarded by lib/url_guard.py, and the secret scanner reports only redacted, fingerprinted findings.</w:t>
+      </w:r>
     </w:p>
     <w:p>
       <w:pPr>
         <w:pBdr>
-          <w:top w:val="single" w:color="C9D4E0" w:sz="8" w:space="6"/>
+          <w:top w:val="single" w:color="C9D4E0" w:sz="8" w:space="2"/>
         </w:pBdr>
-        <w:spacing w:before="120"/>
+        <w:spacing w:before="0" w:after="0"/>
       </w:pPr>
       <w:r>
         <w:rPr>
@@ -6813,10 +6894,6 @@
     </w:sectPr>
   </w:body>
 </w:document>
-</file>
-
-<file path=word/comments.xml><?xml version="1.0" encoding="utf-8"?>
-<w:comments xmlns:cx="http://schemas.microsoft.com/office/drawing/2014/chartex" xmlns:cx1="http://schemas.microsoft.com/office/drawing/2015/9/8/chartex" xmlns:cx2="http://schemas.microsoft.com/office/drawing/2015/10/21/chartex" xmlns:cx3="http://schemas.microsoft.com/office/drawing/2016/5/9/chartex" xmlns:cx4="http://schemas.microsoft.com/office/drawing/2016/5/10/chartex" xmlns:cx5="http://schemas.microsoft.com/office/drawing/2016/5/11/chartex" xmlns:cx6="http://schemas.microsoft.com/office/drawing/2016/5/12/chartex" xmlns:cx7="http://schemas.microsoft.com/office/drawing/2016/5/13/chartex" xmlns:cx8="http://schemas.microsoft.com/office/drawing/2016/5/14/chartex" xmlns:mc="http://schemas.openxmlformats.org/markup-compatibility/2006" xmlns:aink="http://schemas.microsoft.com/office/drawing/2016/ink" xmlns:am3d="http://schemas.microsoft.com/office/drawing/2017/model3d" xmlns:o="urn:schemas-microsoft-com:office:office" xmlns:r="http://schemas.openxmlformats.org/officeDocument/2006/relationships" xmlns:m="http://schemas.openxmlformats.org/officeDocument/2006/math" xmlns:v="urn:schemas-microsoft-com:vml" xmlns:wp14="http://schemas.microsoft.com/office/word/2010/wordprocessingDrawing" xmlns:wp="http://schemas.openxmlformats.org/drawingml/2006/wordprocessingDrawing" xmlns:w10="urn:schemas-microsoft-com:office:word" xmlns:w="http://schemas.openxmlformats.org/wordprocessingml/2006/main" xmlns:w14="http://schemas.microsoft.com/office/word/2010/wordml" xmlns:w15="http://schemas.microsoft.com/office/word/2012/wordml" xmlns:w16cex="http://schemas.microsoft.com/office/word/2018/wordml/cex" xmlns:w16cid="http://schemas.microsoft.com/office/word/2016/wordml/cid" xmlns:w16="http://schemas.microsoft.com/office/word/2018/wordml" xmlns:w16sdtdh="http://schemas.microsoft.com/office/word/2020/wordml/sdtdatahash" xmlns:w16se="http://schemas.microsoft.com/office/word/2015/wordml/symex" xmlns:wpg="http://schemas.microsoft.com/office/word/2010/wordprocessingGroup" xmlns:wpi="http://schemas.microsoft.com/office/word/2010/wordprocessingInk" xmlns:wne="http://schemas.microsoft.com/office/word/2006/wordml" xmlns:wps="http://schemas.microsoft.com/office/word/2010/wordprocessingShape"/>
 </file>
 
 <file path=word/endnotes.xml><?xml version="1.0" encoding="utf-8"?>

</xml_diff>

<commit_message>
Prepare Solo Suite v1.0.24 release candidate
</commit_message>
<xml_diff>
--- a/site-doctor-cheatsheet.docx
+++ b/site-doctor-cheatsheet.docx
@@ -48,7 +48,7 @@
           <w:sz w:val="18"/>
           <w:szCs w:val="18"/>
         </w:rPr>
-        <w:t xml:space="preserve">Complete audit, debug &amp; fix toolkit for production websites and databases  ·  Claude Code plugin  ·  v3.3.0</w:t>
+        <w:t>Complete audit, debug &amp; fix toolkit for production websites and databases  ·  Claude Code plugin  ·  v3.6.2</w:t>
       </w:r>
     </w:p>
     <w:p>
@@ -853,7 +853,7 @@
                 <w:sz w:val="19"/>
                 <w:szCs w:val="19"/>
               </w:rPr>
-              <w:t xml:space="preserve">Deep OWASP Top 10 review — injection, broken auth, access control / IDOR, XSS, SSRF, secrets, CVEs.</w:t>
+              <w:t>Static OWASP Top 10 code/config review — auth, access control / IDOR, injection, XSS, SSRF, secrets, CVEs; dynamic checks are manual-only.</w:t>
             </w:r>
           </w:p>
         </w:tc>
@@ -4240,7 +4240,7 @@
           <w:sz w:val="21"/>
           <w:szCs w:val="21"/>
         </w:rPr>
-        <w:t xml:space="preserve">  — scans a codebase for hardcoded secrets</w:t>
+        <w:t xml:space="preserve">  — redacted working-tree scan; optional bounded local Git-object history</w:t>
       </w:r>
     </w:p>
     <w:p>
@@ -4615,7 +4615,7 @@
                 <w:sz w:val="20"/>
                 <w:szCs w:val="20"/>
               </w:rPr>
-              <w:t xml:space="preserve">Do a deep security review of my web app at https://example.com — codebase is at ./src, which I own and am authorized to test. Run the secret scanner, then walk the full OWASP Top 10: injection, broken auth, access control/IDOR, XSS, SSRF, deserialization, and dependency CVEs. Tag each finding with its OWASP category and a non-destructive repro.</w:t>
+              <w:t>Do a static security review of my web app; the codebase is at ./src. Do not probe the live URL or make dynamic requests. Run the local redacted secret scanner, then review the OWASP Top 10 in code and configuration: injection, broken auth, access control/IDOR, XSS, SSRF, deserialization, and dependency CVEs. Tag each finding with code evidence and a non-destructive local repro. For anything requiring dynamic validation, provide a manual test plan and stop for explicit confirmation.</w:t>
             </w:r>
           </w:p>
         </w:tc>
@@ -5065,7 +5065,7 @@
                 <w:sz w:val="20"/>
                 <w:szCs w:val="20"/>
               </w:rPr>
-              <w:t xml:space="preserve">Audit my PostgreSQL database (read-only connection: postgres://readonly@host/db). Check schema quality, missing/redundant indexes, the slowest queries, security, and data integrity. Use read-only queries only, and give me a severity-ranked report with the exact query result as evidence and a migration or command for each fix.</w:t>
+              <w:t>Audit my PostgreSQL database using the read-only connection profile named APP_AUDIT_DB. Its credential is stored outside the repository; do not print its DSN or secret. Confirm that the session is read-only, then check schema quality, missing/redundant indexes, slow queries, security, and data integrity. Use read-only queries only and give me a severity-ranked report with redacted evidence plus a proposed migration or command for each fix.</w:t>
             </w:r>
           </w:p>
         </w:tc>
@@ -6416,7 +6416,7 @@
                 <w:sz w:val="20"/>
                 <w:szCs w:val="20"/>
               </w:rPr>
-              <w:t xml:space="preserve">Audit my signup and checkout forms on https://example.com for conversion and quality. Walk through completing them, then review field friction (are we asking for too much?), inline validation and error handling, accessibility (labels, keyboard, screen-reader errors), submission feedback and double-submit protection, security and spam protection, and the mobile input experience. Rank by conversion and access impact.</w:t>
+              <w:t>Audit my signup and checkout forms on https://example.com for conversion and quality using read-only UI/code inspection only; do not submit either form. Review field friction, inline validation and errors, accessibility (labels, keyboard, screen-reader errors), submission feedback and double-submit protection, security/spam protection, and mobile inputs. Rank findings by conversion and access impact. If end-to-end submission is needed, hand off to /browser:form-submit-test and stop for explicit approval.</w:t>
             </w:r>
           </w:p>
         </w:tc>
@@ -6783,15 +6783,96 @@
     </w:tbl>
     <w:p>
       <w:pPr>
-        <w:spacing w:after="160"/>
-      </w:pPr>
+        <w:spacing w:after="120"/>
+      </w:pPr>
+      <w:r>
+        <w:rPr>
+          <w:rFonts w:ascii="Calibri" w:cs="Calibri" w:eastAsia="Calibri" w:hAnsi="Calibri"/>
+          <w:b/>
+          <w:bCs/>
+          <w:color w:val="1F3864"/>
+          <w:sz w:val="28"/>
+          <w:szCs w:val="28"/>
+        </w:rPr>
+        <w:t xml:space="preserve">About this cheat sheet</w:t>
+      </w:r>
+    </w:p>
+    <w:p>
+      <w:pPr>
+        <w:spacing w:after="80"/>
+      </w:pPr>
+      <w:r>
+        <w:rPr>
+          <w:rFonts w:ascii="Calibri" w:cs="Calibri" w:eastAsia="Calibri" w:hAnsi="Calibri"/>
+          <w:color w:val="333333"/>
+          <w:sz w:val="20"/>
+          <w:szCs w:val="20"/>
+        </w:rPr>
+        <w:t>Version: site-doctor v3.6.2 — shipped with solo-suite 1.0.24 (MIT license).</w:t>
+      </w:r>
+    </w:p>
+    <w:p>
+      <w:pPr>
+        <w:spacing w:after="80"/>
+      </w:pPr>
+      <w:r>
+        <w:rPr>
+          <w:rFonts w:ascii="Calibri" w:cs="Calibri" w:eastAsia="Calibri" w:hAnsi="Calibri"/>
+          <w:color w:val="333333"/>
+          <w:sz w:val="20"/>
+          <w:szCs w:val="20"/>
+        </w:rPr>
+        <w:t xml:space="preserve">Install: /plugin marketplace add unn0wn002/solo-suite, then /plugin install site-doctor@solo-suite — or /plugin install full-team@solo-suite for the complete 18-plugin suite.</w:t>
+      </w:r>
+    </w:p>
+    <w:p>
+      <w:pPr>
+        <w:spacing w:after="80"/>
+      </w:pPr>
+      <w:r>
+        <w:rPr>
+          <w:rFonts w:ascii="Calibri" w:cs="Calibri" w:eastAsia="Calibri" w:hAnsi="Calibri"/>
+          <w:color w:val="333333"/>
+          <w:sz w:val="20"/>
+          <w:szCs w:val="20"/>
+        </w:rPr>
+        <w:t xml:space="preserve">Every audit here is read-only and evidence-based; the fix, migration, and load-test commands are manual-only and always confirm before changing anything. Vendor-specific checks run only for providers recorded in .solo/stack.md.</w:t>
+      </w:r>
+    </w:p>
+    <w:p>
+      <w:pPr>
+        <w:spacing w:after="80"/>
+      </w:pPr>
+      <w:r>
+        <w:rPr>
+          <w:rFonts w:ascii="Calibri" w:cs="Calibri" w:eastAsia="Calibri" w:hAnsi="Calibri"/>
+          <w:color w:val="333333"/>
+          <w:sz w:val="20"/>
+          <w:szCs w:val="20"/>
+        </w:rPr>
+        <w:t xml:space="preserve">Full command reference: README.md. Changes: CHANGELOG.md. Vulnerability reports: SECURITY.md.</w:t>
+      </w:r>
+    </w:p>
+    <w:p>
+      <w:pPr>
+        <w:spacing w:after="80"/>
+      </w:pPr>
+      <w:r>
+        <w:rPr>
+          <w:rFonts w:ascii="Calibri" w:cs="Calibri" w:eastAsia="Calibri" w:hAnsi="Calibri"/>
+          <w:color w:val="333333"/>
+          <w:sz w:val="20"/>
+          <w:szCs w:val="20"/>
+        </w:rPr>
+        <w:t xml:space="preserve">The bundled helper scripts are Python stdlib only and are invoked via ${CLAUDE_PLUGIN_ROOT}, so they work from any directory; outbound requests are SSRF-guarded by lib/url_guard.py, and the secret scanner reports only redacted, fingerprinted findings.</w:t>
+      </w:r>
     </w:p>
     <w:p>
       <w:pPr>
         <w:pBdr>
-          <w:top w:val="single" w:color="C9D4E0" w:sz="8" w:space="6"/>
+          <w:top w:val="single" w:color="C9D4E0" w:sz="8" w:space="2"/>
         </w:pBdr>
-        <w:spacing w:before="120"/>
+        <w:spacing w:before="0" w:after="0"/>
       </w:pPr>
       <w:r>
         <w:rPr>
@@ -6813,10 +6894,6 @@
     </w:sectPr>
   </w:body>
 </w:document>
-</file>
-
-<file path=word/comments.xml><?xml version="1.0" encoding="utf-8"?>
-<w:comments xmlns:cx="http://schemas.microsoft.com/office/drawing/2014/chartex" xmlns:cx1="http://schemas.microsoft.com/office/drawing/2015/9/8/chartex" xmlns:cx2="http://schemas.microsoft.com/office/drawing/2015/10/21/chartex" xmlns:cx3="http://schemas.microsoft.com/office/drawing/2016/5/9/chartex" xmlns:cx4="http://schemas.microsoft.com/office/drawing/2016/5/10/chartex" xmlns:cx5="http://schemas.microsoft.com/office/drawing/2016/5/11/chartex" xmlns:cx6="http://schemas.microsoft.com/office/drawing/2016/5/12/chartex" xmlns:cx7="http://schemas.microsoft.com/office/drawing/2016/5/13/chartex" xmlns:cx8="http://schemas.microsoft.com/office/drawing/2016/5/14/chartex" xmlns:mc="http://schemas.openxmlformats.org/markup-compatibility/2006" xmlns:aink="http://schemas.microsoft.com/office/drawing/2016/ink" xmlns:am3d="http://schemas.microsoft.com/office/drawing/2017/model3d" xmlns:o="urn:schemas-microsoft-com:office:office" xmlns:r="http://schemas.openxmlformats.org/officeDocument/2006/relationships" xmlns:m="http://schemas.openxmlformats.org/officeDocument/2006/math" xmlns:v="urn:schemas-microsoft-com:vml" xmlns:wp14="http://schemas.microsoft.com/office/word/2010/wordprocessingDrawing" xmlns:wp="http://schemas.openxmlformats.org/drawingml/2006/wordprocessingDrawing" xmlns:w10="urn:schemas-microsoft-com:office:word" xmlns:w="http://schemas.openxmlformats.org/wordprocessingml/2006/main" xmlns:w14="http://schemas.microsoft.com/office/word/2010/wordml" xmlns:w15="http://schemas.microsoft.com/office/word/2012/wordml" xmlns:w16cex="http://schemas.microsoft.com/office/word/2018/wordml/cex" xmlns:w16cid="http://schemas.microsoft.com/office/word/2016/wordml/cid" xmlns:w16="http://schemas.microsoft.com/office/word/2018/wordml" xmlns:w16sdtdh="http://schemas.microsoft.com/office/word/2020/wordml/sdtdatahash" xmlns:w16se="http://schemas.microsoft.com/office/word/2015/wordml/symex" xmlns:wpg="http://schemas.microsoft.com/office/word/2010/wordprocessingGroup" xmlns:wpi="http://schemas.microsoft.com/office/word/2010/wordprocessingInk" xmlns:wne="http://schemas.microsoft.com/office/word/2006/wordml" xmlns:wps="http://schemas.microsoft.com/office/word/2010/wordprocessingShape"/>
 </file>
 
 <file path=word/endnotes.xml><?xml version="1.0" encoding="utf-8"?>

</xml_diff>

<commit_message>
Prepare Solo Suite v1.0.25 release candidate
</commit_message>
<xml_diff>
--- a/site-doctor-cheatsheet.docx
+++ b/site-doctor-cheatsheet.docx
@@ -48,7 +48,7 @@
           <w:sz w:val="18"/>
           <w:szCs w:val="18"/>
         </w:rPr>
-        <w:t xml:space="preserve">Complete audit, debug &amp; fix toolkit for production websites and databases  ·  Claude Code plugin  ·  v3.3.0</w:t>
+        <w:t>Complete audit, debug &amp; fix toolkit for production websites and databases  ·  Claude Code plugin  ·  v3.6.2</w:t>
       </w:r>
     </w:p>
     <w:p>
@@ -853,7 +853,7 @@
                 <w:sz w:val="19"/>
                 <w:szCs w:val="19"/>
               </w:rPr>
-              <w:t xml:space="preserve">Deep OWASP Top 10 review — injection, broken auth, access control / IDOR, XSS, SSRF, secrets, CVEs.</w:t>
+              <w:t>Static OWASP Top 10 code/config review — auth, access control / IDOR, injection, XSS, SSRF, secrets, CVEs; dynamic checks are manual-only.</w:t>
             </w:r>
           </w:p>
         </w:tc>
@@ -4240,7 +4240,7 @@
           <w:sz w:val="21"/>
           <w:szCs w:val="21"/>
         </w:rPr>
-        <w:t xml:space="preserve">  — scans a codebase for hardcoded secrets</w:t>
+        <w:t xml:space="preserve">  — redacted working-tree scan; optional bounded local Git-object history</w:t>
       </w:r>
     </w:p>
     <w:p>
@@ -4615,7 +4615,7 @@
                 <w:sz w:val="20"/>
                 <w:szCs w:val="20"/>
               </w:rPr>
-              <w:t xml:space="preserve">Do a deep security review of my web app at https://example.com — codebase is at ./src, which I own and am authorized to test. Run the secret scanner, then walk the full OWASP Top 10: injection, broken auth, access control/IDOR, XSS, SSRF, deserialization, and dependency CVEs. Tag each finding with its OWASP category and a non-destructive repro.</w:t>
+              <w:t>Do a static security review of my web app; the codebase is at ./src. Do not probe the live URL or make dynamic requests. Run the local redacted secret scanner, then review the OWASP Top 10 in code and configuration: injection, broken auth, access control/IDOR, XSS, SSRF, deserialization, and dependency CVEs. Tag each finding with code evidence and a non-destructive local repro. For anything requiring dynamic validation, provide a manual test plan and stop for explicit confirmation.</w:t>
             </w:r>
           </w:p>
         </w:tc>
@@ -5065,7 +5065,7 @@
                 <w:sz w:val="20"/>
                 <w:szCs w:val="20"/>
               </w:rPr>
-              <w:t xml:space="preserve">Audit my PostgreSQL database (read-only connection: postgres://readonly@host/db). Check schema quality, missing/redundant indexes, the slowest queries, security, and data integrity. Use read-only queries only, and give me a severity-ranked report with the exact query result as evidence and a migration or command for each fix.</w:t>
+              <w:t>Audit my PostgreSQL database using the read-only connection profile named APP_AUDIT_DB. Its credential is stored outside the repository; do not print its DSN or secret. Confirm that the session is read-only, then check schema quality, missing/redundant indexes, slow queries, security, and data integrity. Use read-only queries only and give me a severity-ranked report with redacted evidence plus a proposed migration or command for each fix.</w:t>
             </w:r>
           </w:p>
         </w:tc>
@@ -6416,7 +6416,7 @@
                 <w:sz w:val="20"/>
                 <w:szCs w:val="20"/>
               </w:rPr>
-              <w:t xml:space="preserve">Audit my signup and checkout forms on https://example.com for conversion and quality. Walk through completing them, then review field friction (are we asking for too much?), inline validation and error handling, accessibility (labels, keyboard, screen-reader errors), submission feedback and double-submit protection, security and spam protection, and the mobile input experience. Rank by conversion and access impact.</w:t>
+              <w:t>Audit my signup and checkout forms on https://example.com for conversion and quality using read-only UI/code inspection only; do not submit either form. Review field friction, inline validation and errors, accessibility (labels, keyboard, screen-reader errors), submission feedback and double-submit protection, security/spam protection, and mobile inputs. Rank findings by conversion and access impact. If end-to-end submission is needed, hand off to /browser:form-submit-test and stop for explicit approval.</w:t>
             </w:r>
           </w:p>
         </w:tc>
@@ -6783,15 +6783,96 @@
     </w:tbl>
     <w:p>
       <w:pPr>
-        <w:spacing w:after="160"/>
-      </w:pPr>
+        <w:spacing w:after="120"/>
+      </w:pPr>
+      <w:r>
+        <w:rPr>
+          <w:rFonts w:ascii="Calibri" w:cs="Calibri" w:eastAsia="Calibri" w:hAnsi="Calibri"/>
+          <w:b/>
+          <w:bCs/>
+          <w:color w:val="1F3864"/>
+          <w:sz w:val="28"/>
+          <w:szCs w:val="28"/>
+        </w:rPr>
+        <w:t xml:space="preserve">About this cheat sheet</w:t>
+      </w:r>
+    </w:p>
+    <w:p>
+      <w:pPr>
+        <w:spacing w:after="80"/>
+      </w:pPr>
+      <w:r>
+        <w:rPr>
+          <w:rFonts w:ascii="Calibri" w:cs="Calibri" w:eastAsia="Calibri" w:hAnsi="Calibri"/>
+          <w:color w:val="333333"/>
+          <w:sz w:val="20"/>
+          <w:szCs w:val="20"/>
+        </w:rPr>
+        <w:t>Version: site-doctor v3.6.2 — shipped with solo-suite 1.0.25 (MIT license).</w:t>
+      </w:r>
+    </w:p>
+    <w:p>
+      <w:pPr>
+        <w:spacing w:after="80"/>
+      </w:pPr>
+      <w:r>
+        <w:rPr>
+          <w:rFonts w:ascii="Calibri" w:cs="Calibri" w:eastAsia="Calibri" w:hAnsi="Calibri"/>
+          <w:color w:val="333333"/>
+          <w:sz w:val="20"/>
+          <w:szCs w:val="20"/>
+        </w:rPr>
+        <w:t xml:space="preserve">Install: /plugin marketplace add unn0wn002/solo-suite, then /plugin install site-doctor@solo-suite — or /plugin install full-team@solo-suite for the complete 18-plugin suite.</w:t>
+      </w:r>
+    </w:p>
+    <w:p>
+      <w:pPr>
+        <w:spacing w:after="80"/>
+      </w:pPr>
+      <w:r>
+        <w:rPr>
+          <w:rFonts w:ascii="Calibri" w:cs="Calibri" w:eastAsia="Calibri" w:hAnsi="Calibri"/>
+          <w:color w:val="333333"/>
+          <w:sz w:val="20"/>
+          <w:szCs w:val="20"/>
+        </w:rPr>
+        <w:t xml:space="preserve">Every audit here is read-only and evidence-based; the fix, migration, and load-test commands are manual-only and always confirm before changing anything. Vendor-specific checks run only for providers recorded in .solo/stack.md.</w:t>
+      </w:r>
+    </w:p>
+    <w:p>
+      <w:pPr>
+        <w:spacing w:after="80"/>
+      </w:pPr>
+      <w:r>
+        <w:rPr>
+          <w:rFonts w:ascii="Calibri" w:cs="Calibri" w:eastAsia="Calibri" w:hAnsi="Calibri"/>
+          <w:color w:val="333333"/>
+          <w:sz w:val="20"/>
+          <w:szCs w:val="20"/>
+        </w:rPr>
+        <w:t xml:space="preserve">Full command reference: README.md. Changes: CHANGELOG.md. Vulnerability reports: SECURITY.md.</w:t>
+      </w:r>
+    </w:p>
+    <w:p>
+      <w:pPr>
+        <w:spacing w:after="80"/>
+      </w:pPr>
+      <w:r>
+        <w:rPr>
+          <w:rFonts w:ascii="Calibri" w:cs="Calibri" w:eastAsia="Calibri" w:hAnsi="Calibri"/>
+          <w:color w:val="333333"/>
+          <w:sz w:val="20"/>
+          <w:szCs w:val="20"/>
+        </w:rPr>
+        <w:t xml:space="preserve">The bundled helper scripts are Python stdlib only and are invoked via ${CLAUDE_PLUGIN_ROOT}, so they work from any directory; outbound requests are SSRF-guarded by lib/url_guard.py, and the secret scanner reports only redacted, fingerprinted findings.</w:t>
+      </w:r>
     </w:p>
     <w:p>
       <w:pPr>
         <w:pBdr>
-          <w:top w:val="single" w:color="C9D4E0" w:sz="8" w:space="6"/>
+          <w:top w:val="single" w:color="C9D4E0" w:sz="8" w:space="2"/>
         </w:pBdr>
-        <w:spacing w:before="120"/>
+        <w:spacing w:before="0" w:after="0"/>
       </w:pPr>
       <w:r>
         <w:rPr>
@@ -6813,10 +6894,6 @@
     </w:sectPr>
   </w:body>
 </w:document>
-</file>
-
-<file path=word/comments.xml><?xml version="1.0" encoding="utf-8"?>
-<w:comments xmlns:cx="http://schemas.microsoft.com/office/drawing/2014/chartex" xmlns:cx1="http://schemas.microsoft.com/office/drawing/2015/9/8/chartex" xmlns:cx2="http://schemas.microsoft.com/office/drawing/2015/10/21/chartex" xmlns:cx3="http://schemas.microsoft.com/office/drawing/2016/5/9/chartex" xmlns:cx4="http://schemas.microsoft.com/office/drawing/2016/5/10/chartex" xmlns:cx5="http://schemas.microsoft.com/office/drawing/2016/5/11/chartex" xmlns:cx6="http://schemas.microsoft.com/office/drawing/2016/5/12/chartex" xmlns:cx7="http://schemas.microsoft.com/office/drawing/2016/5/13/chartex" xmlns:cx8="http://schemas.microsoft.com/office/drawing/2016/5/14/chartex" xmlns:mc="http://schemas.openxmlformats.org/markup-compatibility/2006" xmlns:aink="http://schemas.microsoft.com/office/drawing/2016/ink" xmlns:am3d="http://schemas.microsoft.com/office/drawing/2017/model3d" xmlns:o="urn:schemas-microsoft-com:office:office" xmlns:r="http://schemas.openxmlformats.org/officeDocument/2006/relationships" xmlns:m="http://schemas.openxmlformats.org/officeDocument/2006/math" xmlns:v="urn:schemas-microsoft-com:vml" xmlns:wp14="http://schemas.microsoft.com/office/word/2010/wordprocessingDrawing" xmlns:wp="http://schemas.openxmlformats.org/drawingml/2006/wordprocessingDrawing" xmlns:w10="urn:schemas-microsoft-com:office:word" xmlns:w="http://schemas.openxmlformats.org/wordprocessingml/2006/main" xmlns:w14="http://schemas.microsoft.com/office/word/2010/wordml" xmlns:w15="http://schemas.microsoft.com/office/word/2012/wordml" xmlns:w16cex="http://schemas.microsoft.com/office/word/2018/wordml/cex" xmlns:w16cid="http://schemas.microsoft.com/office/word/2016/wordml/cid" xmlns:w16="http://schemas.microsoft.com/office/word/2018/wordml" xmlns:w16sdtdh="http://schemas.microsoft.com/office/word/2020/wordml/sdtdatahash" xmlns:w16se="http://schemas.microsoft.com/office/word/2015/wordml/symex" xmlns:wpg="http://schemas.microsoft.com/office/word/2010/wordprocessingGroup" xmlns:wpi="http://schemas.microsoft.com/office/word/2010/wordprocessingInk" xmlns:wne="http://schemas.microsoft.com/office/word/2006/wordml" xmlns:wps="http://schemas.microsoft.com/office/word/2010/wordprocessingShape"/>
 </file>
 
 <file path=word/endnotes.xml><?xml version="1.0" encoding="utf-8"?>

</xml_diff>

<commit_message>
Harden evidence and release verification for v1.0.26
</commit_message>
<xml_diff>
--- a/site-doctor-cheatsheet.docx
+++ b/site-doctor-cheatsheet.docx
@@ -48,7 +48,7 @@
           <w:sz w:val="18"/>
           <w:szCs w:val="18"/>
         </w:rPr>
-        <w:t>Complete audit, debug &amp; fix toolkit for production websites and databases  ·  Claude Code plugin  ·  v3.6.2</w:t>
+        <w:t>Complete audit, debug &amp; fix toolkit for production websites and databases  ·  Claude Code plugin  ·  v3.6.3</w:t>
       </w:r>
     </w:p>
     <w:p>
@@ -6808,7 +6808,7 @@
           <w:sz w:val="20"/>
           <w:szCs w:val="20"/>
         </w:rPr>
-        <w:t>Version: site-doctor v3.6.2 — shipped with solo-suite 1.0.25 (MIT license).</w:t>
+        <w:t>Version: site-doctor v3.6.3 — shipped with solo-suite 1.0.26 (MIT license).</w:t>
       </w:r>
     </w:p>
     <w:p>

</xml_diff>

<commit_message>
Implement v1.0.27 suite remediation
</commit_message>
<xml_diff>
--- a/site-doctor-cheatsheet.docx
+++ b/site-doctor-cheatsheet.docx
@@ -48,7 +48,7 @@
           <w:sz w:val="18"/>
           <w:szCs w:val="18"/>
         </w:rPr>
-        <w:t>Complete audit, debug &amp; fix toolkit for production websites and databases  ·  Claude Code plugin  ·  v3.6.3</w:t>
+        <w:t>Complete audit, debug &amp; fix toolkit for production websites and databases  ·  Claude Code plugin  ·  v3.6.4</w:t>
       </w:r>
     </w:p>
     <w:p>
@@ -6808,7 +6808,7 @@
           <w:sz w:val="20"/>
           <w:szCs w:val="20"/>
         </w:rPr>
-        <w:t>Version: site-doctor v3.6.3 — shipped with solo-suite 1.0.26 (MIT license).</w:t>
+        <w:t>Version: site-doctor v3.6.4 — shipped with solo-suite 1.0.27 (MIT license).</w:t>
       </w:r>
     </w:p>
     <w:p>

</xml_diff>

<commit_message>
Cut v1.0.27 release candidate
</commit_message>
<xml_diff>
--- a/site-doctor-cheatsheet.docx
+++ b/site-doctor-cheatsheet.docx
@@ -660,6 +660,9 @@
         </w:tc>
       </w:tr>
       <w:tr>
+        <w:trPr>
+          <w:cantSplit/>
+        </w:trPr>
         <w:tc>
           <w:tcPr>
             <w:tcW w:type="dxa" w:w="3100"/>
@@ -969,6 +972,9 @@
         </w:tc>
       </w:tr>
       <w:tr>
+        <w:trPr>
+          <w:cantSplit/>
+        </w:trPr>
         <w:tc>
           <w:tcPr>
             <w:tcW w:type="dxa" w:w="3100"/>
@@ -1498,6 +1504,9 @@
         </w:tc>
       </w:tr>
       <w:tr>
+        <w:trPr>
+          <w:cantSplit/>
+        </w:trPr>
         <w:tc>
           <w:tcPr>
             <w:tcW w:type="dxa" w:w="3300"/>
@@ -4898,6 +4907,7 @@
     </w:p>
     <w:p>
       <w:pPr>
+        <w:keepNext/>
         <w:pStyle w:val="Heading2"/>
         <w:spacing w:after="80" w:before="200"/>
       </w:pPr>
@@ -4929,6 +4939,9 @@
         <w:gridCol w:w="9360"/>
       </w:tblGrid>
       <w:tr>
+        <w:trPr>
+          <w:cantSplit/>
+        </w:trPr>
         <w:tc>
           <w:tcPr>
             <w:tcW w:type="dxa" w:w="9360"/>
@@ -5659,6 +5672,7 @@
     </w:p>
     <w:p>
       <w:pPr>
+        <w:keepNext/>
         <w:pStyle w:val="Heading2"/>
         <w:spacing w:after="80" w:before="200"/>
       </w:pPr>
@@ -5690,6 +5704,9 @@
         <w:gridCol w:w="9360"/>
       </w:tblGrid>
       <w:tr>
+        <w:trPr>
+          <w:cantSplit/>
+        </w:trPr>
         <w:tc>
           <w:tcPr>
             <w:tcW w:type="dxa" w:w="9360"/>
@@ -6698,6 +6715,7 @@
     </w:p>
     <w:p>
       <w:pPr>
+        <w:keepNext/>
         <w:pStyle w:val="Heading2"/>
         <w:spacing w:after="80" w:before="200"/>
       </w:pPr>
@@ -6729,6 +6747,9 @@
         <w:gridCol w:w="9360"/>
       </w:tblGrid>
       <w:tr>
+        <w:trPr>
+          <w:cantSplit/>
+        </w:trPr>
         <w:tc>
           <w:tcPr>
             <w:tcW w:type="dxa" w:w="9360"/>

</xml_diff>